<commit_message>
Fig. 15 (benefit versus the commitment) and Zhang-style restyling of all figures
- New Fig. 15: stacked contributions of revenue, energy, delay, degradation and shortfall to the benefit
  of JR-D versus the commitment, with the cost-optimal commitment and the firm capacity, and the net
  benefit of all controllers (Section 5.8)
- Shared framed legends below Figs. 6 and 13; cost groups of Fig. 14 in a validated palette
- Section 5.6: the cost optimum explained by the payment reaching the physical reduction limit
- Captions of Figs. 1, 2 and 15; Word build expects 22 captions

Co-Authored-By: Claude Opus 5.5 <noreply@anthropic.com>
Claude-Session: https://claude.ai/code/session_01PnB9F6XnrS6GFU4G3jPuy6
</commit_message>
<xml_diff>
--- a/paper/word/manuscript.docx
+++ b/paper/word/manuscript.docx
@@ -5396,7 +5396,7 @@
       <w:r>
         <w:drawing>
           <wp:inline>
-            <wp:extent cx="5381999" cy="3276132"/>
+            <wp:extent cx="5723999" cy="2868396"/>
             <wp:effectExtent b="0" l="0" r="0" t="0"/>
             <wp:docPr descr="" title="" id="25" name="Picture"/>
             <a:graphic>
@@ -5417,7 +5417,7 @@
                   <pic:spPr bwMode="auto">
                     <a:xfrm>
                       <a:off x="0" y="0"/>
-                      <a:ext cx="5381999" cy="3276132"/>
+                      <a:ext cx="5723999" cy="2868396"/>
                     </a:xfrm>
                     <a:prstGeom prst="rect">
                       <a:avLst/>
@@ -5451,7 +5451,7 @@
         <w:t xml:space="preserve"> </w:t>
       </w:r>
       <w:r>
-        <w:t xml:space="preserve">System and recovery channel. (a) AI data-center integrated energy system: grid connection, PV, gas engine with absorption chiller (CCHP), electric chillers, chilled-water storage (TES), BESS, and the GPU cluster with fixed load and three deferrable classes C1–C3 (lag bounds 0.5, 1.5 and 3 h); the day-ahead commitment and the intraday controller act on the flexible resources. (b) Two consecutive DR events: after the first event, computing catch-up and storage recharge are repaid through one recovery channel between the baseline and the connection limit.</w:t>
+        <w:t xml:space="preserve">Physical architecture and recovery channel. (a) AI data-center integrated energy system: the energy supply (grid connection, PV), conversion and storage (gas engine with heat recovery, BESS), cooling supply (absorption chiller, electric chillers, chilled-water TES) and computing (inference and non-deferrable training, three deferrable classes C1–C3 with lag bounds 0.5, 1.5 and 3 h) subsystems on one AC bus, with the electricity, heat, cooling, control and settlement flows that close the computing–energy–thermal loop; the DR operator, the day-ahead commitment and the intraday controller form the dispatch layer. (b) Two consecutive DR events: after the first event, computing catch-up and storage recharge are repaid through one recovery channel between the baseline and the connection limit.</w:t>
       </w:r>
     </w:p>
     <w:bookmarkEnd w:id="27"/>
@@ -12688,7 +12688,7 @@
       <w:r>
         <w:drawing>
           <wp:inline>
-            <wp:extent cx="5338799" cy="2640434"/>
+            <wp:extent cx="5723999" cy="2883788"/>
             <wp:effectExtent b="0" l="0" r="0" t="0"/>
             <wp:docPr descr="" title="" id="40" name="Picture"/>
             <a:graphic>
@@ -12709,7 +12709,7 @@
                   <pic:spPr bwMode="auto">
                     <a:xfrm>
                       <a:off x="0" y="0"/>
-                      <a:ext cx="5338799" cy="2640434"/>
+                      <a:ext cx="5723999" cy="2883788"/>
                     </a:xfrm>
                     <a:prstGeom prst="rect">
                       <a:avLst/>
@@ -12743,7 +12743,7 @@
         <w:t xml:space="preserve"> </w:t>
       </w:r>
       <w:r>
-        <w:t xml:space="preserve">Recovery-aware coordinated scheduling framework. Day-ahead layer: closed-loop back-test of the intraday controller on the historical days, capability per day, Wasserstein-robust capacity (Proposition 3) and cost-optimal commitment (21). Intraday layer: cross-event joint recovery MPC with a 15-min step and an 18-h horizon.</w:t>
+        <w:t xml:space="preserve">Recovery-aware coordinated scheduling framework. Day-ahead layer: closed-loop back-test of the intraday controller on the historical days, capability per day, Wasserstein-robust capacity (Proposition 3) and cost-optimal commitment (21). Intraday layer: cross-event joint recovery MPC with a 15-min step and an 18-h horizon. Badges: lines of Algorithm 1 in Table 1.</w:t>
       </w:r>
     </w:p>
     <w:bookmarkStart w:id="46" w:name="day-ahead-recovery-aware-commitment"/>
@@ -19887,7 +19887,7 @@
     </w:p>
     <w:bookmarkEnd w:id="49"/>
     <w:bookmarkEnd w:id="50"/>
-    <w:bookmarkStart w:id="95" w:name="case-studies"/>
+    <w:bookmarkStart w:id="98" w:name="case-studies"/>
     <w:p>
       <w:pPr>
         <w:pStyle w:val="Heading1"/>
@@ -20587,7 +20587,7 @@
       <w:r>
         <w:drawing>
           <wp:inline>
-            <wp:extent cx="5723999" cy="4213749"/>
+            <wp:extent cx="5723999" cy="4211548"/>
             <wp:effectExtent b="0" l="0" r="0" t="0"/>
             <wp:docPr descr="" title="" id="53" name="Picture"/>
             <a:graphic>
@@ -20608,7 +20608,7 @@
                   <pic:spPr bwMode="auto">
                     <a:xfrm>
                       <a:off x="0" y="0"/>
-                      <a:ext cx="5723999" cy="4213749"/>
+                      <a:ext cx="5723999" cy="4211548"/>
                     </a:xfrm>
                     <a:prstGeom prst="rect">
                       <a:avLst/>
@@ -20773,7 +20773,7 @@
       <w:r>
         <w:drawing>
           <wp:inline>
-            <wp:extent cx="5428799" cy="2505599"/>
+            <wp:extent cx="5479199" cy="2602467"/>
             <wp:effectExtent b="0" l="0" r="0" t="0"/>
             <wp:docPr descr="" title="" id="59" name="Picture"/>
             <a:graphic>
@@ -20794,7 +20794,7 @@
                   <pic:spPr bwMode="auto">
                     <a:xfrm>
                       <a:off x="0" y="0"/>
-                      <a:ext cx="5428799" cy="2505599"/>
+                      <a:ext cx="5479199" cy="2602467"/>
                     </a:xfrm>
                     <a:prstGeom prst="rect">
                       <a:avLst/>
@@ -20998,7 +20998,7 @@
       <w:r>
         <w:drawing>
           <wp:inline>
-            <wp:extent cx="5716799" cy="3988961"/>
+            <wp:extent cx="5716799" cy="4113901"/>
             <wp:effectExtent b="0" l="0" r="0" t="0"/>
             <wp:docPr descr="" title="" id="63" name="Picture"/>
             <a:graphic>
@@ -21019,7 +21019,7 @@
                   <pic:spPr bwMode="auto">
                     <a:xfrm>
                       <a:off x="0" y="0"/>
-                      <a:ext cx="5716799" cy="3988961"/>
+                      <a:ext cx="5716799" cy="4113901"/>
                     </a:xfrm>
                     <a:prstGeom prst="rect">
                       <a:avLst/>
@@ -21650,7 +21650,7 @@
       <w:r>
         <w:drawing>
           <wp:inline>
-            <wp:extent cx="2786399" cy="2612631"/>
+            <wp:extent cx="2786399" cy="2588242"/>
             <wp:effectExtent b="0" l="0" r="0" t="0"/>
             <wp:docPr descr="" title="" id="66" name="Picture"/>
             <a:graphic>
@@ -21671,7 +21671,7 @@
                   <pic:spPr bwMode="auto">
                     <a:xfrm>
                       <a:off x="0" y="0"/>
-                      <a:ext cx="2786399" cy="2612631"/>
+                      <a:ext cx="2786399" cy="2588242"/>
                     </a:xfrm>
                     <a:prstGeom prst="rect">
                       <a:avLst/>
@@ -21978,7 +21978,7 @@
       <w:r>
         <w:drawing>
           <wp:inline>
-            <wp:extent cx="5641199" cy="2639264"/>
+            <wp:extent cx="5666399" cy="2612213"/>
             <wp:effectExtent b="0" l="0" r="0" t="0"/>
             <wp:docPr descr="" title="" id="77" name="Picture"/>
             <a:graphic>
@@ -21999,7 +21999,7 @@
                   <pic:spPr bwMode="auto">
                     <a:xfrm>
                       <a:off x="0" y="0"/>
-                      <a:ext cx="5641199" cy="2639264"/>
+                      <a:ext cx="5666399" cy="2612213"/>
                     </a:xfrm>
                     <a:prstGeom prst="rect">
                       <a:avLst/>
@@ -22308,7 +22308,7 @@
         <w:t xml:space="preserve"> </w:t>
       </w:r>
       <w:r>
-        <w:t xml:space="preserve">The commitment (21) minimises the back-tested cost below the robust capacity. It selects 7 MW for JR-D in both scenarios and 6 MW for JR-M in S1, which are delivered in full on all 26 operating days, with benefits of 44.8 (S1) and 43.1 k CNY/day (S2) for JR-D and 35.8 k CNY/day for JR-M (Table 5). For JR-D the cost minimum lies below the capability limit, because the payment is capped at 120 % of the commitment while the delay cost keeps growing with it; in S1 the certified margin at 7 MW is 0.063 MW, five times the margin at 8.0 MW. Independent recovery receives no robust commitment in either scenario, which is the right decision: at 1 MW it delivers in full on only 69–73 % of the operating days. Commitments derived from physical capability are not deliverable. The perfect-recourse model (22) commits the single-event capabilities of 8.18/7.98 MW in S1, which JR-D delivers in full on 85 % of the days; operated by independent recovery, as in conventional single-event practice, the share falls to 27 % (IR-O*) and 0 % (IR-P); supplementary Fig. S2 places all commitment methods in the plane of out-of-sample reliability and benefit.</w:t>
+        <w:t xml:space="preserve">The commitment (21) minimises the back-tested cost below the robust capacity. It selects 7 MW for JR-D in both scenarios and 6 MW for JR-M in S1, which are delivered in full on all 26 operating days, with benefits of 44.8 (S1) and 43.1 k CNY/day (S2) for JR-D and 35.8 k CNY/day for JR-M (Table 5). For JR-D the cost minimum lies below the capability limit: the payment, capped at 120 % of the commitment, grows with the commitment only until the reduction reaches its physical maximum of about 8 MW, beyond which a larger commitment adds shortfall risk but no revenue; in S1 the certified margin at 7 MW is 0.063 MW, five times the margin at 8.0 MW. Independent recovery receives no robust commitment in either scenario, which is the right decision: at 1 MW it delivers in full on only 69–73 % of the operating days. Commitments derived from physical capability are not deliverable. The perfect-recourse model (22) commits the single-event capabilities of 8.18/7.98 MW in S1, which JR-D delivers in full on 85 % of the days; operated by independent recovery, as in conventional single-event practice, the share falls to 27 % (IR-O*) and 0 % (IR-P); supplementary Fig. S2 places all commitment methods in the plane of out-of-sample reliability and benefit.</w:t>
       </w:r>
     </w:p>
     <w:p>
@@ -24445,7 +24445,7 @@
       <w:r>
         <w:drawing>
           <wp:inline>
-            <wp:extent cx="5723999" cy="2181425"/>
+            <wp:extent cx="5723999" cy="2250981"/>
             <wp:effectExtent b="0" l="0" r="0" t="0"/>
             <wp:docPr descr="" title="" id="85" name="Picture"/>
             <a:graphic>
@@ -24466,7 +24466,7 @@
                   <pic:spPr bwMode="auto">
                     <a:xfrm>
                       <a:off x="0" y="0"/>
-                      <a:ext cx="5723999" cy="2181425"/>
+                      <a:ext cx="5723999" cy="2250981"/>
                     </a:xfrm>
                     <a:prstGeom prst="rect">
                       <a:avLst/>
@@ -24582,7 +24582,7 @@
       </w:r>
     </w:p>
     <w:bookmarkEnd w:id="87"/>
-    <w:bookmarkStart w:id="94" w:name="service-quality-economics-and-robustness"/>
+    <w:bookmarkStart w:id="97" w:name="service-quality-economics-and-robustness"/>
     <w:p>
       <w:pPr>
         <w:pStyle w:val="Heading2"/>
@@ -24616,7 +24616,7 @@
       <w:r>
         <w:drawing>
           <wp:inline>
-            <wp:extent cx="5669999" cy="4340903"/>
+            <wp:extent cx="5669999" cy="4499419"/>
             <wp:effectExtent b="0" l="0" r="0" t="0"/>
             <wp:docPr descr="" title="" id="89" name="Picture"/>
             <a:graphic>
@@ -24637,7 +24637,7 @@
                   <pic:spPr bwMode="auto">
                     <a:xfrm>
                       <a:off x="0" y="0"/>
-                      <a:ext cx="5669999" cy="4340903"/>
+                      <a:ext cx="5669999" cy="4499419"/>
                     </a:xfrm>
                     <a:prstGeom prst="rect">
                       <a:avLst/>
@@ -24699,7 +24699,7 @@
       <w:r>
         <w:drawing>
           <wp:inline>
-            <wp:extent cx="5723999" cy="4705601"/>
+            <wp:extent cx="5723999" cy="4765449"/>
             <wp:effectExtent b="0" l="0" r="0" t="0"/>
             <wp:docPr descr="" title="" id="92" name="Picture"/>
             <a:graphic>
@@ -24720,7 +24720,7 @@
                   <pic:spPr bwMode="auto">
                     <a:xfrm>
                       <a:off x="0" y="0"/>
-                      <a:ext cx="5723999" cy="4705601"/>
+                      <a:ext cx="5723999" cy="4765449"/>
                     </a:xfrm>
                     <a:prstGeom prst="rect">
                       <a:avLst/>
@@ -24762,6 +24762,137 @@
         <w:pStyle w:val="BodyText"/>
       </w:pPr>
       <w:r>
+        <w:t xml:space="preserve">Fig. 15 resolves the benefit over the commitment. For JR-D the DR revenue grows almost linearly with the commitment, at the 120 % payment cap, up to 6.5 MW and saturates at 48.3 k CNY/day from 7 MW on, when the reduction reaches its physical maximum; the delay cost grows convexly, to 4.4 k CNY/day in S1 and 6.4 k CNY/day in S2 at 7 MW, and the shortfall assessment sets in at 8 MW (0.2 k CNY/day, rising to 5.7 k CNY/day at 9 MW). The benefit therefore peaks at 7–7.5 MW, with 44.8 k CNY/day in S1 and 43.1 k CNY/day in S2, exactly where the day-ahead layer places the cost-optimal commitment and where the firm capacity lies (Fig. 15a, b). At every commitment from 1 to 9 MW, JR-D yields the largest benefit of the four controllers in both scenarios (Fig. 15c, d): its firm capacity and its economic optimum coincide.</w:t>
+      </w:r>
+    </w:p>
+    <w:p>
+      <w:pPr>
+        <w:pStyle w:val="Figure"/>
+      </w:pPr>
+      <w:r>
+        <w:drawing>
+          <wp:inline>
+            <wp:extent cx="5723999" cy="3884509"/>
+            <wp:effectExtent b="0" l="0" r="0" t="0"/>
+            <wp:docPr descr="" title="" id="95" name="Picture"/>
+            <a:graphic>
+              <a:graphicData uri="http://schemas.openxmlformats.org/drawingml/2006/picture">
+                <pic:pic>
+                  <pic:nvPicPr>
+                    <pic:cNvPr descr="/home/user/datacenter/paper/figures/Fig15_commitment_benefit.png" id="96" name="Picture"/>
+                    <pic:cNvPicPr>
+                      <a:picLocks noChangeArrowheads="1" noChangeAspect="1"/>
+                    </pic:cNvPicPr>
+                  </pic:nvPicPr>
+                  <pic:blipFill>
+                    <a:blip r:embed="rId94"/>
+                    <a:stretch>
+                      <a:fillRect/>
+                    </a:stretch>
+                  </pic:blipFill>
+                  <pic:spPr bwMode="auto">
+                    <a:xfrm>
+                      <a:off x="0" y="0"/>
+                      <a:ext cx="5723999" cy="3884509"/>
+                    </a:xfrm>
+                    <a:prstGeom prst="rect">
+                      <a:avLst/>
+                    </a:prstGeom>
+                    <a:noFill/>
+                    <a:ln w="9525">
+                      <a:noFill/>
+                      <a:headEnd/>
+                      <a:tailEnd/>
+                    </a:ln>
+                  </pic:spPr>
+                </pic:pic>
+              </a:graphicData>
+            </a:graphic>
+          </wp:inline>
+        </w:drawing>
+      </w:r>
+    </w:p>
+    <w:p>
+      <w:pPr>
+        <w:pStyle w:val="FigureCaption"/>
+      </w:pPr>
+      <w:r>
+        <w:rPr>
+          <w:bCs/>
+          <w:b/>
+        </w:rPr>
+        <w:t xml:space="preserve">Fig. 15.</w:t>
+      </w:r>
+      <w:r>
+        <w:t xml:space="preserve"> </w:t>
+      </w:r>
+      <w:r>
+        <w:t xml:space="preserve">Daily benefit relative to no DR versus the uniform commitment on the 26 operating days in S1 (a, c) and S2 (b, d): (a, b) contributions of the cost groups for JR-D, with the DR revenue and the energy savings stacked above and the task delay, storage degradation and shortfall assessment stacked below zero, and the net benefit (line); dashed: cost-optimal day-ahead commitment</w:t>
+      </w:r>
+      <w:r>
+        <w:t xml:space="preserve"> </w:t>
+      </w:r>
+      <m:oMath>
+        <m:sSup>
+          <m:e>
+            <m:r>
+              <m:t>C</m:t>
+            </m:r>
+          </m:e>
+          <m:sup>
+            <m:r>
+              <m:rPr>
+                <m:lit/>
+                <m:sty m:val="p"/>
+              </m:rPr>
+              <m:t>*</m:t>
+            </m:r>
+          </m:sup>
+        </m:sSup>
+      </m:oMath>
+      <w:r>
+        <w:t xml:space="preserve">; dash-dotted: firm capacity</w:t>
+      </w:r>
+      <w:r>
+        <w:t xml:space="preserve"> </w:t>
+      </w:r>
+      <m:oMath>
+        <m:sSubSup>
+          <m:e>
+            <m:r>
+              <m:t>C</m:t>
+            </m:r>
+          </m:e>
+          <m:sub>
+            <m:r>
+              <m:t>0.95</m:t>
+            </m:r>
+          </m:sub>
+          <m:sup>
+            <m:r>
+              <m:t>f</m:t>
+            </m:r>
+            <m:r>
+              <m:t>i</m:t>
+            </m:r>
+            <m:r>
+              <m:t>r</m:t>
+            </m:r>
+            <m:r>
+              <m:t>m</m:t>
+            </m:r>
+          </m:sup>
+        </m:sSubSup>
+      </m:oMath>
+      <w:r>
+        <w:t xml:space="preserve">; shaded: commitments delivered in full on at least 95 % of the days; (c, d) net benefit of all controllers, filled markers where full delivery is reached on at least 95 % of the days at that commitment.</w:t>
+      </w:r>
+    </w:p>
+    <w:p>
+      <w:pPr>
+        <w:pStyle w:val="BodyText"/>
+      </w:pPr>
+      <w:r>
         <w:rPr>
           <w:bCs/>
           <w:b/>
@@ -24841,9 +24972,9 @@
         <w:t xml:space="preserve">Recovery draws power above the baseline after the events. Under the Jiangsu rules alone, the peak rebound after the events of the DR day is 6.4–6.6 MW for every strategy (S1, 6 MW per event). A rebound assessment lets the grid operator trade it off (supplementary Fig. S4): at 3 CNY/kW per event, JR-D cuts the peak rebound to 0.17 MW and still delivers both events in full, by holding deferred work longer (delay cost +17.9 k CNY) and over-delivering less (DR revenue −4.4 k CNY), whereas IR-O* keeps a rebound of 6.4 MW while its fulfilment falls to 91 %. Joint recovery thus also gives the grid a controllable recovery profile, at a price that the assessment can set.</w:t>
       </w:r>
     </w:p>
-    <w:bookmarkEnd w:id="94"/>
-    <w:bookmarkEnd w:id="95"/>
-    <w:bookmarkStart w:id="96" w:name="conclusions"/>
+    <w:bookmarkEnd w:id="97"/>
+    <w:bookmarkEnd w:id="98"/>
+    <w:bookmarkStart w:id="99" w:name="conclusions"/>
     <w:p>
       <w:pPr>
         <w:pStyle w:val="Heading1"/>
@@ -24934,8 +25065,8 @@
         <w:t xml:space="preserve">For DR practice, these results support sizing consecutive-event contracts of AI data centers by the firm capacity of the controller that operates them rather than by physical capability, and they allow grid operators to accept larger firm commitments from data centers that coordinate computing and storage recovery across events. Future work will extend the framework to geographically distributed data centers that shift work between sites, to the thermal inertia of the server halls as a further recovery resource, and to the co-planning of batteries, connection capacity and DR contracts over the life of the data center.</w:t>
       </w:r>
     </w:p>
-    <w:bookmarkEnd w:id="96"/>
-    <w:bookmarkStart w:id="97" w:name="credit-authorship-contribution-statement"/>
+    <w:bookmarkEnd w:id="99"/>
+    <w:bookmarkStart w:id="100" w:name="credit-authorship-contribution-statement"/>
     <w:p>
       <w:pPr>
         <w:pStyle w:val="Heading1"/>
@@ -24955,8 +25086,8 @@
         <w:t xml:space="preserve">Contribution of each author in the CRediT roles, e.g. Conceptualization, Methodology, Software, Formal analysis, Writing – original draft, Writing – review &amp; editing, Supervision, Funding acquisition.</w:t>
       </w:r>
     </w:p>
-    <w:bookmarkEnd w:id="97"/>
-    <w:bookmarkStart w:id="98" w:name="declaration-of-competing-interest"/>
+    <w:bookmarkEnd w:id="100"/>
+    <w:bookmarkStart w:id="101" w:name="declaration-of-competing-interest"/>
     <w:p>
       <w:pPr>
         <w:pStyle w:val="Heading1"/>
@@ -25000,8 +25131,8 @@
         <w:t xml:space="preserve">”</w:t>
       </w:r>
     </w:p>
-    <w:bookmarkEnd w:id="98"/>
-    <w:bookmarkStart w:id="99" w:name="X071796dd6bc546c91e96cca1cf5ff96599de61f"/>
+    <w:bookmarkEnd w:id="101"/>
+    <w:bookmarkStart w:id="102" w:name="X071796dd6bc546c91e96cca1cf5ff96599de61f"/>
     <w:p>
       <w:pPr>
         <w:pStyle w:val="Heading1"/>
@@ -25085,8 +25216,8 @@
         <w:t xml:space="preserve">”</w:t>
       </w:r>
     </w:p>
-    <w:bookmarkEnd w:id="99"/>
-    <w:bookmarkStart w:id="100" w:name="acknowledgements"/>
+    <w:bookmarkEnd w:id="102"/>
+    <w:bookmarkStart w:id="103" w:name="acknowledgements"/>
     <w:p>
       <w:pPr>
         <w:pStyle w:val="Heading1"/>
@@ -25106,8 +25237,8 @@
         <w:t xml:space="preserve">Funding sources with grant numbers.</w:t>
       </w:r>
     </w:p>
-    <w:bookmarkEnd w:id="100"/>
-    <w:bookmarkStart w:id="101" w:name="data-availability"/>
+    <w:bookmarkEnd w:id="103"/>
+    <w:bookmarkStart w:id="104" w:name="data-availability"/>
     <w:p>
       <w:pPr>
         <w:pStyle w:val="Heading1"/>
@@ -25151,8 +25282,8 @@
         <w:t xml:space="preserve">”</w:t>
       </w:r>
     </w:p>
-    <w:bookmarkEnd w:id="101"/>
-    <w:bookmarkStart w:id="102" w:name="X7a93262262cf2153410ed77390956f6788b11c2"/>
+    <w:bookmarkEnd w:id="104"/>
+    <w:bookmarkStart w:id="105" w:name="X7a93262262cf2153410ed77390956f6788b11c2"/>
     <w:p>
       <w:pPr>
         <w:pStyle w:val="Heading1"/>
@@ -27785,8 +27916,8 @@
         </w:tc>
       </w:tr>
     </w:tbl>
-    <w:bookmarkEnd w:id="102"/>
-    <w:bookmarkStart w:id="103" w:name="appendix-b.-proofs"/>
+    <w:bookmarkEnd w:id="105"/>
+    <w:bookmarkStart w:id="106" w:name="appendix-b.-proofs"/>
     <w:p>
       <w:pPr>
         <w:pStyle w:val="Heading1"/>
@@ -36648,8 +36779,8 @@
         <w:t xml:space="preserve">and breaks this equality; IR-P restores the price part with a day-ahead signal but neither updates it with the realised state nor resolves the non-uniqueness of the IT response at that price (supplementary Fig. S7).</w:t>
       </w:r>
     </w:p>
-    <w:bookmarkEnd w:id="103"/>
-    <w:bookmarkStart w:id="104" w:name="references"/>
+    <w:bookmarkEnd w:id="106"/>
+    <w:bookmarkStart w:id="107" w:name="references"/>
     <w:p>
       <w:pPr>
         <w:pStyle w:val="Heading1"/>
@@ -36962,7 +37093,7 @@
         <w:t xml:space="preserve">[38] General Office of the National Development and Reform Commission. Notice on improving the implementation of the capacity charge for two-part tariff users (Fagai Ban Jiage [2016] No. 1583). Beijing; 2016 (in Chinese).</w:t>
       </w:r>
     </w:p>
-    <w:bookmarkEnd w:id="104"/>
+    <w:bookmarkEnd w:id="107"/>
     <w:sectPr>
       <w:footerReference r:id="rId9" w:type="default"/>
       <w:pgSz w:h="16838" w:w="11906"/>

</xml_diff>

<commit_message>
Polish: run-in heads in Section 5, Fig. 15 numbers in paper/numbers.md, docs updated
- Section 5.4, 5.5, 5.7 and 5.8 paragraphs open with bold run-in heads
- tools/paper_numbers.py: benefit versus commitment table (Fig. 15), equation numbers of the headers
- README, progress log and handover note describe the Applied Energy packaging and Fig. 15
- Word files rebuilt and validated

Co-Authored-By: Claude Opus 5.5 <noreply@anthropic.com>
Claude-Session: https://claude.ai/code/session_01PnB9F6XnrS6GFU4G3jPuy6
</commit_message>
<xml_diff>
--- a/paper/word/manuscript.docx
+++ b/paper/word/manuscript.docx
@@ -21723,6 +21723,16 @@
         <w:pStyle w:val="FirstParagraph"/>
       </w:pPr>
       <w:r>
+        <w:rPr>
+          <w:bCs/>
+          <w:b/>
+        </w:rPr>
+        <w:t xml:space="preserve">Coordination versus foresight.</w:t>
+      </w:r>
+      <w:r>
+        <w:t xml:space="preserve"> </w:t>
+      </w:r>
+      <w:r>
         <w:t xml:space="preserve">Fig. 8 decomposes the firm capacity over the event interval τ, from 15 min to 3 h (two one-hour events, base system, bisection on the 26 operating days). JR-D firmly delivers 7.50–8.00 MW at every interval: with cross-event foresight the firm capacity hardly depends on how soon the next event follows. Without foresight it does. The firm capacity of JR-M rises from 3.50 MW at 15 min to 4.75 MW at 30 min, 6.75 MW at 1 h and 7.75 MW at 2 h and 3 h, so the foresight value, the gain of JR-D over JR-M, is 4.0, 3.0, 1.0, 0.25 and 0 MW. It vanishes once the interval is long enough to repay both debts, the condition of Proposition 2. IR-O* stays below 1 MW at every interval, so the coordination value, the gain of JR-M over IR-O*, is at least 2.5 MW at 15 min and grows to at least 6.75 MW at 2 h and 3 h. Coordination is therefore valuable at every interval, because it lets one controller re-plan all resources on the measured state, while foresight adds its value precisely where coordination alone falls short, at short intervals.</w:t>
       </w:r>
     </w:p>
@@ -21796,6 +21806,16 @@
         <w:pStyle w:val="BodyText"/>
       </w:pPr>
       <w:r>
+        <w:rPr>
+          <w:bCs/>
+          <w:b/>
+        </w:rPr>
+        <w:t xml:space="preserve">Event interval and connection margin.</w:t>
+      </w:r>
+      <w:r>
+        <w:t xml:space="preserve"> </w:t>
+      </w:r>
+      <w:r>
         <w:t xml:space="preserve">At a fixed commitment of 7 MW, the interval–margin map (Fig. 9a–c) confirms the conditions of Proposition 2. JR-D delivers in full on 96–100 % of the days in all 20 combinations of τ and γ. JR-M delivers in full on 0–31 % of the days when the interval is 15 or 30 min and on 88–100 % from 1 h on, whatever the connection margin, so the foresight gain is 69–100 percentage points for τ ≤ 0.5 h, 0–12 points at 1 h and 0–4 points for τ ≥ 2 h (Fig. 9c). A wider connection does not rescue JR-M at short intervals: JR-M enters the interval with the battery that it emptied in the first event, and within 30 min the battery can take back at most 3 MWh at its 6-MW rating, whatever the connection (Section 5.5). Once the interval is long enough to repay both debts, the order of repayment no longer matters, and joint recovery loses its edge, exactly as Proposition 2 predicts. The gain of JR-D over the best independent benchmark (12–54 points, Fig. 9b) shows no trend in τ, consistent with independent recovery failing on baseline deviations rather than on the channel.</w:t>
       </w:r>
     </w:p>
@@ -21869,6 +21889,16 @@
         <w:pStyle w:val="BodyText"/>
       </w:pPr>
       <w:r>
+        <w:rPr>
+          <w:bCs/>
+          <w:b/>
+        </w:rPr>
+        <w:t xml:space="preserve">Lag bounds.</w:t>
+      </w:r>
+      <w:r>
+        <w:t xml:space="preserve"> </w:t>
+      </w:r>
+      <w:r>
         <w:t xml:space="preserve">The lag bounds of the deferrable work decide how much debt can be carried (Fig. 9d; S1, 7 MW, connection kept). With all lag bounds scaled by 0.5, 0.75, 1, 1.25 and 1.5, JR-D delivers both events in full on 96–100 % of the days, whereas JR-M does so on 19, 46, 92, 100 and 100 %. Shorter deadlines shrink the debt that may be carried,</w:t>
       </w:r>
       <w:r>
@@ -21967,6 +21997,16 @@
       <w:pPr>
         <w:pStyle w:val="FirstParagraph"/>
       </w:pPr>
+      <w:r>
+        <w:rPr>
+          <w:bCs/>
+          <w:b/>
+        </w:rPr>
+        <w:t xml:space="preserve">Battery energy.</w:t>
+      </w:r>
+      <w:r>
+        <w:t xml:space="preserve"> </w:t>
+      </w:r>
       <w:r>
         <w:t xml:space="preserve">Fig. 10 translates the capacity gain into the battery energy and the connection capacity that it substitutes. The firm capacities are found by bisection on the 26 operating days of S2 (resolution 0.25 MW). With the connection limit kept at its base value, the firm capacity of JR-D rises from 3.75 MW without a BESS to 6.00 MW with 6 MWh and 7.75 MW with the base 12 MWh (Fig. 10a). JR-M gains much less from the same battery (3.75, 4.50 and 4.75 MW) and never exceeds 5.25 MW, and IR-O* stays below 1 MW at every size: a battery reserved for a fixed share of the reduction cannot absorb the baseline deviations that make independent recovery fail. Cross-event foresight therefore substitutes battery energy. JR-D needs 2.7 MWh to firmly deliver the 4.75 MW that JR-M reaches with 12 MWh, a saving of 9.3 MWh, or about 5.6 million CNY at a system cost of 0.6 CNY/Wh, and no battery size lets JR-M reach the firm capacity of JR-D. Beyond 12 MWh the firm capacity of JR-D declines (7.50 MW at 18 MWh and 6.75 MW at 24 MWh). This decline stems from the baseline rule, not from recovery: a larger battery shaves the evening peak in normal operation, which lowers the five-day baseline and with it the reduction that can be shown against it.</w:t>
       </w:r>
@@ -22041,6 +22081,16 @@
         <w:pStyle w:val="BodyText"/>
       </w:pPr>
       <w:r>
+        <w:rPr>
+          <w:bCs/>
+          <w:b/>
+        </w:rPr>
+        <w:t xml:space="preserve">Connection capacity.</w:t>
+      </w:r>
+      <w:r>
+        <w:t xml:space="preserve"> </w:t>
+      </w:r>
+      <w:r>
         <w:t xml:space="preserve">The connection margin matters much less (Fig. 10b). Raising the connection limit from 14.57 MW (</w:t>
       </w:r>
       <m:oMath>
@@ -24435,6 +24485,16 @@
         <w:pStyle w:val="FirstParagraph"/>
       </w:pPr>
       <w:r>
+        <w:rPr>
+          <w:bCs/>
+          <w:b/>
+        </w:rPr>
+        <w:t xml:space="preserve">Recovery channel.</w:t>
+      </w:r>
+      <w:r>
+        <w:t xml:space="preserve"> </w:t>
+      </w:r>
+      <w:r>
         <w:t xml:space="preserve">The integrated energy system provides the recovery channel. In the two recovery windows of the typical day, the 30-min interval and the two hours after the second event, the no-DR import lies on average 4.8 and 5.3 MW below the connection limit (Fig. 12b). The gas engine, which runs at full output from 14:00 to 22:00 with and without DR, accounts for 3.0 MW of this channel, the absorption chiller, which moves part of the cooling load off the electric chillers, for 0.5 MW, and the cold storage for 0.2 MW; the BESS adds 1.2 MW by shaving the evening peak in normal operation, but under DR it serves the events instead. A grid-only AIDC with the same connection would have almost no channel left (on average −0.3 and +0.4 MW in the two windows). Of the energy that recovery draws through the channel, the gas engine and the absorption chiller provide 85 % (Fig. 5). The cold storage is pre-charged before the events, covers part of the cooling load during both events and is recharged at night, so its own debt never enters the channel.</w:t>
       </w:r>
     </w:p>
@@ -24578,6 +24638,16 @@
         <w:pStyle w:val="BodyText"/>
       </w:pPr>
       <w:r>
+        <w:rPr>
+          <w:bCs/>
+          <w:b/>
+        </w:rPr>
+        <w:t xml:space="preserve">Device and resource ablation.</w:t>
+      </w:r>
+      <w:r>
+        <w:t xml:space="preserve"> </w:t>
+      </w:r>
+      <w:r>
         <w:t xml:space="preserve">Fig. 12a quantifies these roles as firm capacities of JR-D in S2 with the connection limit of the base case. Without the gas engine, and therefore without heat for the absorption chiller, the evening baseline rises by 3.5 MW. This would allow a deeper reduction, but the channel narrows by the same amount and binds first: the firm capacity falls from 7.75 to 5.75 MW. Without the cold storage it falls to 7.50 MW. Without the absorption chiller alone it rises slightly, to 8.00 MW, because the 0.5 MW higher baseline allows a deeper reduction while the channel remains wide enough. Without all three devices the firm capacity is 4.75 MW, 3.0 MW below the full system and as much as cross-event foresight adds at this interval. The resource ablation shows that computing flexibility and storage are complements rather than substitutes. With the BESS alone (no computing flexibility, no cold storage), no commitment of 1 MW or more is firm; with computing flexibility alone the firm capacity is 3.00 MW; with both, still without the cold storage, it is 7.50 MW, nearly twice what the two resources achieve separately (less than 4 MW together). Joint recovery is what turns the two resources into firm capacity: the battery covers the events while the deferred work waits, and the deferred work frees the channel to recharge the battery.</w:t>
       </w:r>
     </w:p>
@@ -24761,6 +24831,16 @@
       <w:pPr>
         <w:pStyle w:val="BodyText"/>
       </w:pPr>
+      <w:r>
+        <w:rPr>
+          <w:bCs/>
+          <w:b/>
+        </w:rPr>
+        <w:t xml:space="preserve">Benefit versus commitment.</w:t>
+      </w:r>
+      <w:r>
+        <w:t xml:space="preserve"> </w:t>
+      </w:r>
       <w:r>
         <w:t xml:space="preserve">Fig. 15 resolves the benefit over the commitment. For JR-D the DR revenue grows almost linearly with the commitment, at the 120 % payment cap, up to 6.5 MW and saturates at 48.3 k CNY/day from 7 MW on, when the reduction reaches its physical maximum; the delay cost grows convexly, to 4.4 k CNY/day in S1 and 6.4 k CNY/day in S2 at 7 MW, and the shortfall assessment sets in at 8 MW (0.2 k CNY/day, rising to 5.7 k CNY/day at 9 MW). The benefit therefore peaks at 7–7.5 MW, with 44.8 k CNY/day in S1 and 43.1 k CNY/day in S2, exactly where the day-ahead layer places the cost-optimal commitment and where the firm capacity lies (Fig. 15a, b). At every commitment from 1 to 9 MW, JR-D yields the largest benefit of the four controllers in both scenarios (Fig. 15c, d): its firm capacity and its economic optimum coincide.</w:t>
       </w:r>

</xml_diff>